<commit_message>
auto(daily): dev loop report 2026-06-19
</commit_message>
<xml_diff>
--- a/reports/hypothesis/2026-06-19.docx
+++ b/reports/hypothesis/2026-06-19.docx
@@ -15,7 +15,7 @@
         <w:rPr>
           <w:i/>
         </w:rPr>
-        <w:t>생성일: 2026-06-19 09:15 KST  |  표본: 측정소당 최소 2604건 / 총 13195건</w:t>
+        <w:t>생성일: 2026-06-19 14:22 KST  |  표본: 측정소당 최소 2610건 / 총 13225건</w:t>
       </w:r>
     </w:p>
     <w:p>
@@ -143,7 +143,7 @@
           </w:tcPr>
           <w:p>
             <w:r>
-              <w:t>36.100</w:t>
+              <w:t>36.102</w:t>
             </w:r>
           </w:p>
         </w:tc>
@@ -153,7 +153,7 @@
           </w:tcPr>
           <w:p>
             <w:r>
-              <w:t>33.159</w:t>
+              <w:t>33.162</w:t>
             </w:r>
           </w:p>
         </w:tc>
@@ -215,7 +215,7 @@
           </w:tcPr>
           <w:p>
             <w:r>
-              <w:t>20.317</w:t>
+              <w:t>20.326</w:t>
             </w:r>
           </w:p>
         </w:tc>
@@ -225,7 +225,7 @@
           </w:tcPr>
           <w:p>
             <w:r>
-              <w:t>17.539</w:t>
+              <w:t>17.558</w:t>
             </w:r>
           </w:p>
         </w:tc>
@@ -235,7 +235,7 @@
           </w:tcPr>
           <w:p>
             <w:r>
-              <w:t>+2.778</w:t>
+              <w:t>+2.767</w:t>
             </w:r>
           </w:p>
         </w:tc>
@@ -265,7 +265,7 @@
           </w:tcPr>
           <w:p>
             <w:r>
-              <w:t>+0.22 (작음)</w:t>
+              <w:t>+0.21 (작음)</w:t>
             </w:r>
           </w:p>
         </w:tc>
@@ -660,7 +660,7 @@
           </w:tcPr>
           <w:p>
             <w:r>
-              <w:t>31.52</w:t>
+              <w:t>31.53</w:t>
             </w:r>
           </w:p>
         </w:tc>
@@ -722,7 +722,7 @@
           </w:tcPr>
           <w:p>
             <w:r>
-              <w:t>83.55</w:t>
+              <w:t>83.75</w:t>
             </w:r>
           </w:p>
         </w:tc>
@@ -784,7 +784,7 @@
           </w:tcPr>
           <w:p>
             <w:r>
-              <w:t>14.23</w:t>
+              <w:t>14.35</w:t>
             </w:r>
           </w:p>
         </w:tc>
@@ -846,7 +846,7 @@
           </w:tcPr>
           <w:p>
             <w:r>
-              <w:t>166.17</w:t>
+              <w:t>165.92</w:t>
             </w:r>
           </w:p>
         </w:tc>
@@ -908,7 +908,7 @@
           </w:tcPr>
           <w:p>
             <w:r>
-              <w:t>66.70</w:t>
+              <w:t>66.99</w:t>
             </w:r>
           </w:p>
         </w:tc>
@@ -938,7 +938,7 @@
           </w:tcPr>
           <w:p>
             <w:r>
-              <w:t>0.020</w:t>
+              <w:t>0.021</w:t>
             </w:r>
           </w:p>
         </w:tc>
@@ -970,7 +970,7 @@
           </w:tcPr>
           <w:p>
             <w:r>
-              <w:t>157.86</w:t>
+              <w:t>158.71</w:t>
             </w:r>
           </w:p>
         </w:tc>
@@ -1029,7 +1029,7 @@
         <w:pStyle w:val="ListBullet"/>
       </w:pPr>
       <w:r>
-        <w:t>'산단 영향군'가 '베이스라인'보다 평균 2.78 높음 (p=0.0000, 효과크기 작음 d=0.22).</w:t>
+        <w:t>'산단 영향군'가 '베이스라인'보다 평균 2.77 높음 (p=0.0000, 효과크기 작음 d=0.21).</w:t>
       </w:r>
     </w:p>
     <w:p>

</xml_diff>